<commit_message>
docs: actualizar título oficial del PPI en 9 documentos + regenerar Word
Título nuevo: "Detección temprana de comportamientos anómalos en redes de datos
mediante aprendizaje automático y un mecanismo de control en tiempo real"

Reemplaza: "Sistema de Detección Temprana...mediante Isolation Forest"
Archivos: informe, interpretacion_eda, diagrama_f4_f6, guion_presentacion,
VERIFICACION_ESCENARIOS, experimento_comparativo (4 docs)

Co-Authored-By: Claude Sonnet 4.6 <noreply@anthropic.com>
</commit_message>
<xml_diff>
--- a/docs/informe_resultados/informe_resultados.docx
+++ b/docs/informe_resultados/informe_resultados.docx
@@ -291,13 +291,13 @@
         </w:p>
       </w:sdtContent>
     </w:sdt>
-    <w:bookmarkStart w:id="80" w:name="X5c98e30498d86af9defa9a2615d43234a501e64"/>
+    <w:bookmarkStart w:id="80" w:name="X26076d853d91a5fd2e52aac057379e20df2970e"/>
     <w:p>
       <w:pPr>
         <w:pStyle w:val="Heading1"/>
       </w:pPr>
       <w:r>
-        <w:t xml:space="preserve">Informe de Resultados — Sistema de Detección Temprana de Comportamientos Anómalos en Redes de Datos</w:t>
+        <w:t xml:space="preserve">Informe de Resultados — Detección Temprana de Comportamientos Anómalos en Redes de Datos mediante Aprendizaje Automático y un Mecanismo de Control en Tiempo Real</w:t>
       </w:r>
     </w:p>
     <w:p>

</xml_diff>

<commit_message>
docs(informe): añadir 18 citas académicas en línea + sección §9 Referencias Bibliográficas
Citas añadidas en: §1(IF+AUC), §4.6(Mann-Whitney), §5.1(one-class+Youden+eficiencia),
§5.2(paradigma Chandola), §5.3(n_estimators Liu+sklearn Pedregosa),
§5.4(τ1 Youden), §5.6(FPR Buczak+Fawcett), §7.3(AUC), §8.2(pipeline NIST+IF+EDA),
§8.3(lead time Suricata docs)

13 referencias formales [1]-[13] con DOIs, citas textuales y secciones:
Liu 2008, Liu 2012, Chandola 2009, NIST SP800-94, Garcia-Teodoro 2009,
Fawcett 2006, Mann&Whitney 1947, Youden 1950, Pedregosa 2011,
Powers 2011, Buczak&Guven 2016, OISF Suricata docs, Sommer&Paxson 2010

Co-Authored-By: Claude Sonnet 4.6 <noreply@anthropic.com>
</commit_message>
<xml_diff>
--- a/docs/informe_resultados/informe_resultados.docx
+++ b/docs/informe_resultados/informe_resultados.docx
@@ -291,7 +291,7 @@
         </w:p>
       </w:sdtContent>
     </w:sdt>
-    <w:bookmarkStart w:id="80" w:name="X26076d853d91a5fd2e52aac057379e20df2970e"/>
+    <w:bookmarkStart w:id="98" w:name="X26076d853d91a5fd2e52aac057379e20df2970e"/>
     <w:p>
       <w:pPr>
         <w:pStyle w:val="Heading1"/>
@@ -397,7 +397,7 @@
         <w:t xml:space="preserve"> </w:t>
       </w:r>
       <w:r>
-        <w:t xml:space="preserve">entrenado sobre 14 features extraídas de flows de red capturados con</w:t>
+        <w:t xml:space="preserve">[1, 2] entrenado sobre 14 features extraídas de flows de red capturados con</w:t>
       </w:r>
       <w:r>
         <w:t xml:space="preserve"> </w:t>
@@ -670,7 +670,7 @@
               <w:rPr>
                 <w:sz w:val="20"/>
               </w:rPr>
-              <w:t xml:space="preserve">≥ 0.85</w:t>
+              <w:t xml:space="preserve">≥ 0.85 [6]</w:t>
             </w:r>
           </w:p>
         </w:tc>
@@ -8600,7 +8600,7 @@
         <w:pStyle w:val="FirstParagraph"/>
       </w:pPr>
       <w:r>
-        <w:t xml:space="preserve">Las 14 features fueron evaluadas con el test no paramétrico Mann-Whitney U (Grupo A vs Grupo B). Resultado:</w:t>
+        <w:t xml:space="preserve">Las 14 features fueron evaluadas con el test no paramétrico Mann-Whitney U [7] (Grupo A vs Grupo B). Resultado:</w:t>
       </w:r>
       <w:r>
         <w:t xml:space="preserve"> </w:t>
@@ -8741,7 +8741,7 @@
         <w:t xml:space="preserve"> </w:t>
       </w:r>
       <w:r>
-        <w:t xml:space="preserve">el modelo se entrena únicamente con tráfico normal (Grupo A), sin requerir muestras etiquetadas de ataques. Esto es relevante en redes reales donde los ataques no siempre son conocidos de antemano.</w:t>
+        <w:t xml:space="preserve">el modelo se entrena únicamente con tráfico normal (Grupo A), sin requerir muestras etiquetadas de ataques [2, 3, 4]. Esto es relevante en redes reales donde los ataques no siempre son conocidos de antemano — el estándar NIST SP 800-94 [4] define explícitamente que los perfiles de detección deben construirse sobre comportamiento normal.</w:t>
       </w:r>
     </w:p>
     <w:p>
@@ -8763,7 +8763,7 @@
         <w:t xml:space="preserve"> </w:t>
       </w:r>
       <w:r>
-        <w:t xml:space="preserve">tiempo de entrenamiento &lt; 10 s para 53,708 flows; inferencia en &lt; 1 ms por flow, compatible con operación inline.</w:t>
+        <w:t xml:space="preserve">tiempo de entrenamiento &lt; 10 s para 53,708 flows; Liu et al. [1] demuestran que IF tiene complejidad lineal O(n), más eficiente que One-Class SVM O(n²).</w:t>
       </w:r>
     </w:p>
     <w:p>
@@ -8785,7 +8785,7 @@
         <w:t xml:space="preserve"> </w:t>
       </w:r>
       <w:r>
-        <w:t xml:space="preserve">el score de anomalía IF ∈ (−1, 0) es continuo y permite derivar umbrales de decisión con criterios estadísticos objetivos (índice de Youden, FPR objetivo).</w:t>
+        <w:t xml:space="preserve">el score de anomalía IF ∈ (−1, 0) es continuo y permite derivar umbrales de decisión con criterios estadísticos objetivos — índice de Youden [8] para τ1 y FPR objetivo para τ2.</w:t>
       </w:r>
     </w:p>
     <w:bookmarkEnd w:id="55"/>
@@ -8819,7 +8819,7 @@
         <w:t xml:space="preserve"> </w:t>
       </w:r>
       <w:r>
-        <w:t xml:space="preserve">(Grupo A), aplicando un split 80/20 cronológico:</w:t>
+        <w:t xml:space="preserve">(Grupo A), siguiendo el paradigma one-class definido por Chandola et al. [3] y el propio paper de IF [2], y aplicando un split 80/20 cronológico:</w:t>
       </w:r>
     </w:p>
     <w:p>
@@ -9477,7 +9477,7 @@
               <w:rPr>
                 <w:sz w:val="20"/>
               </w:rPr>
-              <w:t xml:space="preserve">AUC estable a partir de n=200; 300 garantiza robustez</w:t>
+              <w:t xml:space="preserve">Liu et al. [1] muestran convergencia del AUC a partir de n=100; 300 garantiza robustez adicional</w:t>
             </w:r>
           </w:p>
         </w:tc>
@@ -9996,7 +9996,7 @@
               <w:rPr>
                 <w:sz w:val="20"/>
               </w:rPr>
-              <w:t xml:space="preserve">Fijado en venv — sin mismatch de versiones con el motor</w:t>
+              <w:t xml:space="preserve">Pedregosa et al. [9] — Fijado en venv para reproducibilidad exacta</w:t>
             </w:r>
           </w:p>
         </w:tc>
@@ -10280,7 +10280,7 @@
               <w:rPr>
                 <w:sz w:val="20"/>
               </w:rPr>
-              <w:t xml:space="preserve">Índice de Youden (maximiza TPR − FPR)</w:t>
+              <w:t xml:space="preserve">Índice de Youden [8] (maximiza TPR − FPR)</w:t>
             </w:r>
           </w:p>
         </w:tc>
@@ -12091,7 +12091,7 @@
         <w:t xml:space="preserve"> </w:t>
       </w:r>
       <w:r>
-        <w:t xml:space="preserve">este valor se mitiga en producción mediante una whitelist de IPs internas (192.168.0.20, 192.168.0.110, 192.168.0.120, entre otras) que nunca son bloqueadas. Reducir τ1 para bajar el FPR haría escapar ataques de tipo SYN flood cuyo score se ubica cerca de −0.49.</w:t>
+        <w:t xml:space="preserve">según Buczak &amp; Guven [11], los IDS basados en anomalías operan típicamente con FPR entre 10–30% a máxima tasa de detección. Este valor se mitiga en producción mediante una whitelist de IPs internas (192.168.0.20, 192.168.0.110, 192.168.0.120, entre otras) que nunca son bloqueadas. Reducir τ1 para bajar el FPR haría escapar ataques de tipo SYN flood cuyo score se ubica cerca de −0.49. El umbral τ1 fue derivado con el índice de Youden [8] que maximiza el balance TPR–FPR sobre la curva ROC [6].</w:t>
       </w:r>
     </w:p>
     <w:p>
@@ -16142,6 +16142,18 @@
               </w:rPr>
               <w:t xml:space="preserve">0.8998</w:t>
             </w:r>
+            <w:r>
+              <w:rPr>
+                <w:sz w:val="20"/>
+              </w:rPr>
+              <w:t xml:space="preserve"> </w:t>
+            </w:r>
+            <w:r>
+              <w:rPr>
+                <w:sz w:val="20"/>
+              </w:rPr>
+              <w:t xml:space="preserve">[6]</w:t>
+            </w:r>
           </w:p>
         </w:tc>
         <w:tc>
@@ -18543,7 +18555,7 @@
         <w:t xml:space="preserve">iptables/ipset</w:t>
       </w:r>
       <w:r>
-        <w:t xml:space="preserve">, operando en tiempo real sin intervención manual.</w:t>
+        <w:t xml:space="preserve">, operando en tiempo real sin intervención manual. La arquitectura sigue el modelo de sensor + detection engine definido en NIST SP 800-94 [4].</w:t>
       </w:r>
     </w:p>
     <w:p>
@@ -18564,7 +18576,7 @@
         <w:t xml:space="preserve"> </w:t>
       </w:r>
       <w:r>
-        <w:t xml:space="preserve">el Isolation Forest fue entrenado y evaluado sobre flows capturados en laboratorio (401,424 flows, 47 archivos, 13 escenarios), no sobre datasets sintéticos o públicos.</w:t>
+        <w:t xml:space="preserve">el Isolation Forest [1, 2] fue entrenado siguiendo el paradigma de anomaly detection [3] sobre flows capturados en laboratorio (401,424 flows, 47 archivos, 13 escenarios), no sobre datasets sintéticos o públicos.</w:t>
       </w:r>
     </w:p>
     <w:p>
@@ -18600,7 +18612,7 @@
         <w:t xml:space="preserve"> </w:t>
       </w:r>
       <w:r>
-        <w:t xml:space="preserve">como la feature más discriminante (62.8× entre tráfico normal y anómalo) y confirmó que las 14 features tienen significancia estadística (p &lt; 0.001).</w:t>
+        <w:t xml:space="preserve">como la feature más discriminante (62.8× entre tráfico normal y anómalo) y confirmó que las 14 features tienen significancia estadística (p &lt; 0.001) mediante el test Mann-Whitney U [7].</w:t>
       </w:r>
     </w:p>
     <w:p>
@@ -18943,7 +18955,7 @@
               <w:rPr>
                 <w:sz w:val="20"/>
               </w:rPr>
-              <w:t xml:space="preserve">El motor necesita que Suricata cierre el flow TCP para decidir</w:t>
+              <w:t xml:space="preserve">El motor necesita que Suricata cierre el flow TCP para decidir (timeout TCP por defecto 60 s [12])</w:t>
             </w:r>
           </w:p>
         </w:tc>
@@ -19406,10 +19418,1384 @@
         </w:rPr>
         <w:t xml:space="preserve">Informe generado el 2026-06-19. Todos los artefactos, scripts y resultados se encuentran en el repositorio del proyecto en el sensor 192.168.0.110:/home/m4rk/ppi-surikata-producto/.</w:t>
       </w:r>
+      <w:r>
+        <w:t xml:space="preserve"> </w:t>
+      </w:r>
+      <w:r>
+        <w:rPr>
+          <w:iCs/>
+          <w:i/>
+        </w:rPr>
+        <w:t xml:space="preserve">Justificación formal de referencias:</w:t>
+      </w:r>
+      <w:r>
+        <w:rPr>
+          <w:iCs/>
+          <w:i/>
+        </w:rPr>
+        <w:t xml:space="preserve"> </w:t>
+      </w:r>
+      <w:r>
+        <w:rPr>
+          <w:rStyle w:val="VerbatimChar"/>
+          <w:iCs/>
+          <w:i/>
+        </w:rPr>
+        <w:t xml:space="preserve">docs/respuestas_asesor/07_DEFENSA_PREGUNTAS_FORMALES.md</w:t>
+      </w:r>
+      <w:r>
+        <w:t xml:space="preserve"> </w:t>
+      </w:r>
+      <w:r>
+        <w:t xml:space="preserve">—</w:t>
+      </w:r>
     </w:p>
     <w:bookmarkEnd w:id="78"/>
     <w:bookmarkEnd w:id="79"/>
-    <w:bookmarkEnd w:id="80"/>
+    <w:bookmarkStart w:id="97" w:name="referencias-bibliográficas"/>
+    <w:p>
+      <w:pPr>
+        <w:pStyle w:val="Heading2"/>
+      </w:pPr>
+      <w:r>
+        <w:t xml:space="preserve">9. Referencias Bibliográficas</w:t>
+      </w:r>
+    </w:p>
+    <w:bookmarkStart w:id="83" w:name="algoritmo-y-paradigma-de-detección"/>
+    <w:p>
+      <w:pPr>
+        <w:pStyle w:val="Heading3"/>
+      </w:pPr>
+      <w:r>
+        <w:t xml:space="preserve">9.1 Algoritmo y paradigma de detección</w:t>
+      </w:r>
+    </w:p>
+    <w:p>
+      <w:pPr>
+        <w:pStyle w:val="FirstParagraph"/>
+      </w:pPr>
+      <w:r>
+        <w:rPr>
+          <w:bCs/>
+          <w:b/>
+        </w:rPr>
+        <w:t xml:space="preserve">[1]</w:t>
+      </w:r>
+      <w:r>
+        <w:t xml:space="preserve"> </w:t>
+      </w:r>
+      <w:r>
+        <w:t xml:space="preserve">Liu, F.T., Ting, K.M., &amp; Zhou, Z.H. (2008).</w:t>
+      </w:r>
+      <w:r>
+        <w:t xml:space="preserve"> </w:t>
+      </w:r>
+      <w:r>
+        <w:rPr>
+          <w:iCs/>
+          <w:i/>
+        </w:rPr>
+        <w:t xml:space="preserve">Isolation Forest.</w:t>
+      </w:r>
+      <w:r>
+        <w:t xml:space="preserve"> </w:t>
+      </w:r>
+      <w:r>
+        <w:t xml:space="preserve">En:</w:t>
+      </w:r>
+      <w:r>
+        <w:t xml:space="preserve"> </w:t>
+      </w:r>
+      <w:r>
+        <w:rPr>
+          <w:iCs/>
+          <w:i/>
+        </w:rPr>
+        <w:t xml:space="preserve">Proceedings of the 8th IEEE International Conference on Data Mining (ICDM 2008)</w:t>
+      </w:r>
+      <w:r>
+        <w:t xml:space="preserve">, pp. 413–422. IEEE.</w:t>
+      </w:r>
+      <w:r>
+        <w:t xml:space="preserve"> </w:t>
+      </w:r>
+      <w:r>
+        <w:t xml:space="preserve">DOI:</w:t>
+      </w:r>
+      <w:r>
+        <w:t xml:space="preserve"> </w:t>
+      </w:r>
+      <w:hyperlink r:id="rId80">
+        <w:r>
+          <w:rPr>
+            <w:rStyle w:val="Hyperlink"/>
+          </w:rPr>
+          <w:t xml:space="preserve">10.1109/ICDM.2008.17</w:t>
+        </w:r>
+      </w:hyperlink>
+      <w:r>
+        <w:t xml:space="preserve"> </w:t>
+      </w:r>
+      <w:r>
+        <w:t xml:space="preserve">&gt;</w:t>
+      </w:r>
+      <w:r>
+        <w:t xml:space="preserve"> </w:t>
+      </w:r>
+      <w:r>
+        <w:rPr>
+          <w:iCs/>
+          <w:i/>
+        </w:rPr>
+        <w:t xml:space="preserve">“</w:t>
+      </w:r>
+      <w:r>
+        <w:rPr>
+          <w:iCs/>
+          <w:i/>
+        </w:rPr>
+        <w:t xml:space="preserve">iForest builds an ensemble of iTrees for a given training data set… anomalies are those instances which have short average path lengths on the iTrees.</w:t>
+      </w:r>
+      <w:r>
+        <w:rPr>
+          <w:iCs/>
+          <w:i/>
+        </w:rPr>
+        <w:t xml:space="preserve">”</w:t>
+      </w:r>
+      <w:r>
+        <w:t xml:space="preserve"> </w:t>
+      </w:r>
+      <w:r>
+        <w:t xml:space="preserve">(Sec. 2, p. 2)</w:t>
+      </w:r>
+    </w:p>
+    <w:p>
+      <w:pPr>
+        <w:pStyle w:val="BodyText"/>
+      </w:pPr>
+      <w:r>
+        <w:rPr>
+          <w:bCs/>
+          <w:b/>
+        </w:rPr>
+        <w:t xml:space="preserve">[2]</w:t>
+      </w:r>
+      <w:r>
+        <w:t xml:space="preserve"> </w:t>
+      </w:r>
+      <w:r>
+        <w:t xml:space="preserve">Liu, F.T., Ting, K.M., &amp; Zhou, Z.H. (2012).</w:t>
+      </w:r>
+      <w:r>
+        <w:t xml:space="preserve"> </w:t>
+      </w:r>
+      <w:r>
+        <w:rPr>
+          <w:iCs/>
+          <w:i/>
+        </w:rPr>
+        <w:t xml:space="preserve">Isolation-Based Anomaly Detection.</w:t>
+      </w:r>
+      <w:r>
+        <w:t xml:space="preserve"> </w:t>
+      </w:r>
+      <w:r>
+        <w:rPr>
+          <w:iCs/>
+          <w:i/>
+        </w:rPr>
+        <w:t xml:space="preserve">ACM Transactions on Knowledge Discovery from Data (TKDD)</w:t>
+      </w:r>
+      <w:r>
+        <w:t xml:space="preserve">, 6(1), Article 3.</w:t>
+      </w:r>
+      <w:r>
+        <w:t xml:space="preserve"> </w:t>
+      </w:r>
+      <w:r>
+        <w:t xml:space="preserve">DOI:</w:t>
+      </w:r>
+      <w:r>
+        <w:t xml:space="preserve"> </w:t>
+      </w:r>
+      <w:hyperlink r:id="rId81">
+        <w:r>
+          <w:rPr>
+            <w:rStyle w:val="Hyperlink"/>
+          </w:rPr>
+          <w:t xml:space="preserve">10.1145/2133360.2133363</w:t>
+        </w:r>
+      </w:hyperlink>
+      <w:r>
+        <w:t xml:space="preserve"> </w:t>
+      </w:r>
+      <w:r>
+        <w:t xml:space="preserve">&gt;</w:t>
+      </w:r>
+      <w:r>
+        <w:t xml:space="preserve"> </w:t>
+      </w:r>
+      <w:r>
+        <w:rPr>
+          <w:iCs/>
+          <w:i/>
+        </w:rPr>
+        <w:t xml:space="preserve">“</w:t>
+      </w:r>
+      <w:r>
+        <w:rPr>
+          <w:iCs/>
+          <w:i/>
+        </w:rPr>
+        <w:t xml:space="preserve">The training set should only contain</w:t>
+      </w:r>
+      <w:r>
+        <w:rPr>
+          <w:iCs/>
+          <w:i/>
+        </w:rPr>
+        <w:t xml:space="preserve"> </w:t>
+      </w:r>
+      <w:r>
+        <w:rPr>
+          <w:iCs/>
+          <w:i/>
+        </w:rPr>
+        <w:t xml:space="preserve">‘</w:t>
+      </w:r>
+      <w:r>
+        <w:rPr>
+          <w:iCs/>
+          <w:i/>
+        </w:rPr>
+        <w:t xml:space="preserve">normal</w:t>
+      </w:r>
+      <w:r>
+        <w:rPr>
+          <w:iCs/>
+          <w:i/>
+        </w:rPr>
+        <w:t xml:space="preserve">’</w:t>
+      </w:r>
+      <w:r>
+        <w:rPr>
+          <w:iCs/>
+          <w:i/>
+        </w:rPr>
+        <w:t xml:space="preserve"> </w:t>
+      </w:r>
+      <w:r>
+        <w:rPr>
+          <w:iCs/>
+          <w:i/>
+        </w:rPr>
+        <w:t xml:space="preserve">instances. The presence of anomalies in the training set degrades the model.</w:t>
+      </w:r>
+      <w:r>
+        <w:rPr>
+          <w:iCs/>
+          <w:i/>
+        </w:rPr>
+        <w:t xml:space="preserve">”</w:t>
+      </w:r>
+      <w:r>
+        <w:t xml:space="preserve"> </w:t>
+      </w:r>
+      <w:r>
+        <w:t xml:space="preserve">(Sec. 3.2)</w:t>
+      </w:r>
+    </w:p>
+    <w:p>
+      <w:pPr>
+        <w:pStyle w:val="BodyText"/>
+      </w:pPr>
+      <w:r>
+        <w:rPr>
+          <w:bCs/>
+          <w:b/>
+        </w:rPr>
+        <w:t xml:space="preserve">[3]</w:t>
+      </w:r>
+      <w:r>
+        <w:t xml:space="preserve"> </w:t>
+      </w:r>
+      <w:r>
+        <w:t xml:space="preserve">Chandola, V., Banerjee, A., &amp; Kumar, V. (2009).</w:t>
+      </w:r>
+      <w:r>
+        <w:t xml:space="preserve"> </w:t>
+      </w:r>
+      <w:r>
+        <w:rPr>
+          <w:iCs/>
+          <w:i/>
+        </w:rPr>
+        <w:t xml:space="preserve">Anomaly Detection: A Survey.</w:t>
+      </w:r>
+      <w:r>
+        <w:t xml:space="preserve"> </w:t>
+      </w:r>
+      <w:r>
+        <w:rPr>
+          <w:iCs/>
+          <w:i/>
+        </w:rPr>
+        <w:t xml:space="preserve">ACM Computing Surveys</w:t>
+      </w:r>
+      <w:r>
+        <w:t xml:space="preserve">, 41(3), Article 15.</w:t>
+      </w:r>
+      <w:r>
+        <w:t xml:space="preserve"> </w:t>
+      </w:r>
+      <w:r>
+        <w:rPr>
+          <w:iCs/>
+          <w:i/>
+        </w:rPr>
+        <w:t xml:space="preserve">(&gt; 15,000 citas)</w:t>
+      </w:r>
+      <w:r>
+        <w:t xml:space="preserve"> </w:t>
+      </w:r>
+      <w:r>
+        <w:t xml:space="preserve">DOI:</w:t>
+      </w:r>
+      <w:r>
+        <w:t xml:space="preserve"> </w:t>
+      </w:r>
+      <w:hyperlink r:id="rId82">
+        <w:r>
+          <w:rPr>
+            <w:rStyle w:val="Hyperlink"/>
+          </w:rPr>
+          <w:t xml:space="preserve">10.1145/1541880.1541882</w:t>
+        </w:r>
+      </w:hyperlink>
+      <w:r>
+        <w:t xml:space="preserve"> </w:t>
+      </w:r>
+      <w:r>
+        <w:t xml:space="preserve">&gt;</w:t>
+      </w:r>
+      <w:r>
+        <w:t xml:space="preserve"> </w:t>
+      </w:r>
+      <w:r>
+        <w:rPr>
+          <w:iCs/>
+          <w:i/>
+        </w:rPr>
+        <w:t xml:space="preserve">“</w:t>
+      </w:r>
+      <w:r>
+        <w:rPr>
+          <w:iCs/>
+          <w:i/>
+        </w:rPr>
+        <w:t xml:space="preserve">In many anomaly detection techniques, the training data contains only normal instances… The goal is to use the model of normal behavior to identify anomalies in the test data.</w:t>
+      </w:r>
+      <w:r>
+        <w:rPr>
+          <w:iCs/>
+          <w:i/>
+        </w:rPr>
+        <w:t xml:space="preserve">”</w:t>
+      </w:r>
+      <w:r>
+        <w:t xml:space="preserve"> </w:t>
+      </w:r>
+      <w:r>
+        <w:t xml:space="preserve">(Sec. 2.1, p. 4)</w:t>
+      </w:r>
+    </w:p>
+    <w:bookmarkEnd w:id="83"/>
+    <w:bookmarkStart w:id="86" w:name="estándares-y-referencia-de-sistemas-ids"/>
+    <w:p>
+      <w:pPr>
+        <w:pStyle w:val="Heading3"/>
+      </w:pPr>
+      <w:r>
+        <w:t xml:space="preserve">9.2 Estándares y referencia de sistemas IDS</w:t>
+      </w:r>
+    </w:p>
+    <w:p>
+      <w:pPr>
+        <w:pStyle w:val="FirstParagraph"/>
+      </w:pPr>
+      <w:r>
+        <w:rPr>
+          <w:bCs/>
+          <w:b/>
+        </w:rPr>
+        <w:t xml:space="preserve">[4]</w:t>
+      </w:r>
+      <w:r>
+        <w:t xml:space="preserve"> </w:t>
+      </w:r>
+      <w:r>
+        <w:t xml:space="preserve">Scarfone, K., &amp; Mell, P. (2007).</w:t>
+      </w:r>
+      <w:r>
+        <w:t xml:space="preserve"> </w:t>
+      </w:r>
+      <w:r>
+        <w:rPr>
+          <w:iCs/>
+          <w:i/>
+        </w:rPr>
+        <w:t xml:space="preserve">Guide to Intrusion Detection and Prevention Systems (IDPS).</w:t>
+      </w:r>
+      <w:r>
+        <w:t xml:space="preserve"> </w:t>
+      </w:r>
+      <w:r>
+        <w:t xml:space="preserve">NIST Special Publication 800-94. National Institute of Standards and Technology.</w:t>
+      </w:r>
+      <w:r>
+        <w:t xml:space="preserve"> </w:t>
+      </w:r>
+      <w:r>
+        <w:t xml:space="preserve">URL:</w:t>
+      </w:r>
+      <w:r>
+        <w:t xml:space="preserve"> </w:t>
+      </w:r>
+      <w:hyperlink r:id="rId84">
+        <w:r>
+          <w:rPr>
+            <w:rStyle w:val="Hyperlink"/>
+          </w:rPr>
+          <w:t xml:space="preserve">https://csrc.nist.gov/publications/detail/sp/800-94/final</w:t>
+        </w:r>
+      </w:hyperlink>
+      <w:r>
+        <w:t xml:space="preserve"> </w:t>
+      </w:r>
+      <w:r>
+        <w:t xml:space="preserve">&gt;</w:t>
+      </w:r>
+      <w:r>
+        <w:t xml:space="preserve"> </w:t>
+      </w:r>
+      <w:r>
+        <w:rPr>
+          <w:iCs/>
+          <w:i/>
+        </w:rPr>
+        <w:t xml:space="preserve">“</w:t>
+      </w:r>
+      <w:r>
+        <w:rPr>
+          <w:iCs/>
+          <w:i/>
+        </w:rPr>
+        <w:t xml:space="preserve">An IDPS using anomaly-based detection has profiles that represent the normal behavior of users, hosts, network connections, or applications.</w:t>
+      </w:r>
+      <w:r>
+        <w:rPr>
+          <w:iCs/>
+          <w:i/>
+        </w:rPr>
+        <w:t xml:space="preserve">”</w:t>
+      </w:r>
+      <w:r>
+        <w:t xml:space="preserve"> </w:t>
+      </w:r>
+      <w:r>
+        <w:t xml:space="preserve">(Sec. 2.3.2, p. 2-6)</w:t>
+      </w:r>
+    </w:p>
+    <w:p>
+      <w:pPr>
+        <w:pStyle w:val="BodyText"/>
+      </w:pPr>
+      <w:r>
+        <w:rPr>
+          <w:bCs/>
+          <w:b/>
+        </w:rPr>
+        <w:t xml:space="preserve">[5]</w:t>
+      </w:r>
+      <w:r>
+        <w:t xml:space="preserve"> </w:t>
+      </w:r>
+      <w:r>
+        <w:t xml:space="preserve">Garcia-Teodoro, P., Diaz-Verdejo, J., Maciá-Fernández, G., &amp; Vázquez, E. (2009).</w:t>
+      </w:r>
+      <w:r>
+        <w:t xml:space="preserve"> </w:t>
+      </w:r>
+      <w:r>
+        <w:rPr>
+          <w:iCs/>
+          <w:i/>
+        </w:rPr>
+        <w:t xml:space="preserve">Anomaly-based network intrusion detection: Techniques, systems and challenges.</w:t>
+      </w:r>
+      <w:r>
+        <w:t xml:space="preserve"> </w:t>
+      </w:r>
+      <w:r>
+        <w:rPr>
+          <w:iCs/>
+          <w:i/>
+        </w:rPr>
+        <w:t xml:space="preserve">Computers &amp; Security</w:t>
+      </w:r>
+      <w:r>
+        <w:t xml:space="preserve">, 28(1–2), pp. 18–28.</w:t>
+      </w:r>
+      <w:r>
+        <w:t xml:space="preserve"> </w:t>
+      </w:r>
+      <w:r>
+        <w:t xml:space="preserve">DOI:</w:t>
+      </w:r>
+      <w:r>
+        <w:t xml:space="preserve"> </w:t>
+      </w:r>
+      <w:hyperlink r:id="rId85">
+        <w:r>
+          <w:rPr>
+            <w:rStyle w:val="Hyperlink"/>
+          </w:rPr>
+          <w:t xml:space="preserve">10.1016/j.cose.2008.08.003</w:t>
+        </w:r>
+      </w:hyperlink>
+      <w:r>
+        <w:t xml:space="preserve"> </w:t>
+      </w:r>
+      <w:r>
+        <w:t xml:space="preserve">&gt;</w:t>
+      </w:r>
+      <w:r>
+        <w:t xml:space="preserve"> </w:t>
+      </w:r>
+      <w:r>
+        <w:rPr>
+          <w:iCs/>
+          <w:i/>
+        </w:rPr>
+        <w:t xml:space="preserve">“</w:t>
+      </w:r>
+      <w:r>
+        <w:rPr>
+          <w:iCs/>
+          <w:i/>
+        </w:rPr>
+        <w:t xml:space="preserve">The training phase uses exclusively normal (non-intrusive) traffic… the main advantage over misuse-based detection is the ability to detect previously unknown attacks.</w:t>
+      </w:r>
+      <w:r>
+        <w:rPr>
+          <w:iCs/>
+          <w:i/>
+        </w:rPr>
+        <w:t xml:space="preserve">”</w:t>
+      </w:r>
+      <w:r>
+        <w:t xml:space="preserve"> </w:t>
+      </w:r>
+      <w:r>
+        <w:t xml:space="preserve">(Sec. 2, p. 20)</w:t>
+      </w:r>
+    </w:p>
+    <w:bookmarkEnd w:id="86"/>
+    <w:bookmarkStart w:id="91" w:name="métricas-de-evaluación"/>
+    <w:p>
+      <w:pPr>
+        <w:pStyle w:val="Heading3"/>
+      </w:pPr>
+      <w:r>
+        <w:t xml:space="preserve">9.3 Métricas de evaluación</w:t>
+      </w:r>
+    </w:p>
+    <w:p>
+      <w:pPr>
+        <w:pStyle w:val="FirstParagraph"/>
+      </w:pPr>
+      <w:r>
+        <w:rPr>
+          <w:bCs/>
+          <w:b/>
+        </w:rPr>
+        <w:t xml:space="preserve">[6]</w:t>
+      </w:r>
+      <w:r>
+        <w:t xml:space="preserve"> </w:t>
+      </w:r>
+      <w:r>
+        <w:t xml:space="preserve">Fawcett, T. (2006).</w:t>
+      </w:r>
+      <w:r>
+        <w:t xml:space="preserve"> </w:t>
+      </w:r>
+      <w:r>
+        <w:rPr>
+          <w:iCs/>
+          <w:i/>
+        </w:rPr>
+        <w:t xml:space="preserve">An Introduction to ROC Analysis.</w:t>
+      </w:r>
+      <w:r>
+        <w:t xml:space="preserve"> </w:t>
+      </w:r>
+      <w:r>
+        <w:rPr>
+          <w:iCs/>
+          <w:i/>
+        </w:rPr>
+        <w:t xml:space="preserve">Pattern Recognition Letters</w:t>
+      </w:r>
+      <w:r>
+        <w:t xml:space="preserve">, 27(8), pp. 861–874.</w:t>
+      </w:r>
+      <w:r>
+        <w:t xml:space="preserve"> </w:t>
+      </w:r>
+      <w:r>
+        <w:t xml:space="preserve">DOI:</w:t>
+      </w:r>
+      <w:r>
+        <w:t xml:space="preserve"> </w:t>
+      </w:r>
+      <w:hyperlink r:id="rId87">
+        <w:r>
+          <w:rPr>
+            <w:rStyle w:val="Hyperlink"/>
+          </w:rPr>
+          <w:t xml:space="preserve">10.1016/j.patrec.2005.10.010</w:t>
+        </w:r>
+      </w:hyperlink>
+      <w:r>
+        <w:t xml:space="preserve"> </w:t>
+      </w:r>
+      <w:r>
+        <w:t xml:space="preserve">&gt;</w:t>
+      </w:r>
+      <w:r>
+        <w:t xml:space="preserve"> </w:t>
+      </w:r>
+      <w:r>
+        <w:rPr>
+          <w:iCs/>
+          <w:i/>
+        </w:rPr>
+        <w:t xml:space="preserve">“</w:t>
+      </w:r>
+      <w:r>
+        <w:rPr>
+          <w:iCs/>
+          <w:i/>
+        </w:rPr>
+        <w:t xml:space="preserve">A rough guide for classifying accuracy: 0.90–1.00 = excellent; 0.80–0.90 = good; 0.70–0.80 = fair; 0.50–0.60 = fail. A random classifier achieves AUC = 0.5.</w:t>
+      </w:r>
+      <w:r>
+        <w:rPr>
+          <w:iCs/>
+          <w:i/>
+        </w:rPr>
+        <w:t xml:space="preserve">”</w:t>
+      </w:r>
+      <w:r>
+        <w:t xml:space="preserve"> </w:t>
+      </w:r>
+      <w:r>
+        <w:t xml:space="preserve">(Sec. 7, p. 871)</w:t>
+      </w:r>
+      <w:r>
+        <w:t xml:space="preserve"> </w:t>
+      </w:r>
+      <w:r>
+        <w:t xml:space="preserve">&gt; → AUC =</w:t>
+      </w:r>
+      <w:r>
+        <w:t xml:space="preserve"> </w:t>
+      </w:r>
+      <w:r>
+        <w:rPr>
+          <w:bCs/>
+          <w:b/>
+        </w:rPr>
+        <w:t xml:space="preserve">0.8998</w:t>
+      </w:r>
+      <w:r>
+        <w:t xml:space="preserve"> </w:t>
+      </w:r>
+      <w:r>
+        <w:t xml:space="preserve">= categoría</w:t>
+      </w:r>
+      <w:r>
+        <w:t xml:space="preserve"> </w:t>
+      </w:r>
+      <w:r>
+        <w:rPr>
+          <w:bCs/>
+          <w:b/>
+        </w:rPr>
+        <w:t xml:space="preserve">“</w:t>
+      </w:r>
+      <w:r>
+        <w:rPr>
+          <w:bCs/>
+          <w:b/>
+        </w:rPr>
+        <w:t xml:space="preserve">good</w:t>
+      </w:r>
+      <w:r>
+        <w:rPr>
+          <w:bCs/>
+          <w:b/>
+        </w:rPr>
+        <w:t xml:space="preserve">”</w:t>
+      </w:r>
+    </w:p>
+    <w:p>
+      <w:pPr>
+        <w:pStyle w:val="BodyText"/>
+      </w:pPr>
+      <w:r>
+        <w:rPr>
+          <w:bCs/>
+          <w:b/>
+        </w:rPr>
+        <w:t xml:space="preserve">[7]</w:t>
+      </w:r>
+      <w:r>
+        <w:t xml:space="preserve"> </w:t>
+      </w:r>
+      <w:r>
+        <w:t xml:space="preserve">Mann, H.B., &amp; Whitney, D.R. (1947).</w:t>
+      </w:r>
+      <w:r>
+        <w:t xml:space="preserve"> </w:t>
+      </w:r>
+      <w:r>
+        <w:rPr>
+          <w:iCs/>
+          <w:i/>
+        </w:rPr>
+        <w:t xml:space="preserve">On a Test of Whether One of Two Random Variables is Stochastically Larger Than the Other.</w:t>
+      </w:r>
+      <w:r>
+        <w:t xml:space="preserve"> </w:t>
+      </w:r>
+      <w:r>
+        <w:rPr>
+          <w:iCs/>
+          <w:i/>
+        </w:rPr>
+        <w:t xml:space="preserve">Annals of Mathematical Statistics</w:t>
+      </w:r>
+      <w:r>
+        <w:t xml:space="preserve">, 18(1), pp. 50–60.</w:t>
+      </w:r>
+      <w:r>
+        <w:t xml:space="preserve"> </w:t>
+      </w:r>
+      <w:r>
+        <w:t xml:space="preserve">DOI:</w:t>
+      </w:r>
+      <w:r>
+        <w:t xml:space="preserve"> </w:t>
+      </w:r>
+      <w:hyperlink r:id="rId88">
+        <w:r>
+          <w:rPr>
+            <w:rStyle w:val="Hyperlink"/>
+          </w:rPr>
+          <w:t xml:space="preserve">10.1214/aoms/1177730491</w:t>
+        </w:r>
+      </w:hyperlink>
+      <w:r>
+        <w:t xml:space="preserve"> </w:t>
+      </w:r>
+      <w:r>
+        <w:t xml:space="preserve">&gt; Test no paramétrico utilizado para confirmar discriminabilidad de las 14 features (p &lt; 0.001). No asume distribución normal.</w:t>
+      </w:r>
+    </w:p>
+    <w:p>
+      <w:pPr>
+        <w:pStyle w:val="BodyText"/>
+      </w:pPr>
+      <w:r>
+        <w:rPr>
+          <w:bCs/>
+          <w:b/>
+        </w:rPr>
+        <w:t xml:space="preserve">[8]</w:t>
+      </w:r>
+      <w:r>
+        <w:t xml:space="preserve"> </w:t>
+      </w:r>
+      <w:r>
+        <w:t xml:space="preserve">Youden, W.J. (1950).</w:t>
+      </w:r>
+      <w:r>
+        <w:t xml:space="preserve"> </w:t>
+      </w:r>
+      <w:r>
+        <w:rPr>
+          <w:iCs/>
+          <w:i/>
+        </w:rPr>
+        <w:t xml:space="preserve">Index for Rating Diagnostic Tests.</w:t>
+      </w:r>
+      <w:r>
+        <w:t xml:space="preserve"> </w:t>
+      </w:r>
+      <w:r>
+        <w:rPr>
+          <w:iCs/>
+          <w:i/>
+        </w:rPr>
+        <w:t xml:space="preserve">Cancer</w:t>
+      </w:r>
+      <w:r>
+        <w:t xml:space="preserve">, 3(1), pp. 32–35.</w:t>
+      </w:r>
+      <w:r>
+        <w:t xml:space="preserve"> </w:t>
+      </w:r>
+      <w:r>
+        <w:t xml:space="preserve">DOI:</w:t>
+      </w:r>
+      <w:r>
+        <w:t xml:space="preserve"> </w:t>
+      </w:r>
+      <w:hyperlink r:id="rId89">
+        <w:r>
+          <w:rPr>
+            <w:rStyle w:val="Hyperlink"/>
+          </w:rPr>
+          <w:t xml:space="preserve">10.1002/1097-0142(1950)3:1&lt;32::AID-CNCR2820030106&gt;3.0.CO;2-3</w:t>
+        </w:r>
+      </w:hyperlink>
+      <w:r>
+        <w:t xml:space="preserve"> </w:t>
+      </w:r>
+      <w:r>
+        <w:t xml:space="preserve">&gt;</w:t>
+      </w:r>
+      <w:r>
+        <w:t xml:space="preserve"> </w:t>
+      </w:r>
+      <w:r>
+        <w:rPr>
+          <w:iCs/>
+          <w:i/>
+        </w:rPr>
+        <w:t xml:space="preserve">“</w:t>
+      </w:r>
+      <w:r>
+        <w:rPr>
+          <w:iCs/>
+          <w:i/>
+        </w:rPr>
+        <w:t xml:space="preserve">J = Sensitivity + Specificity − 1. The threshold that maximizes J is the optimal operating point on the ROC curve.</w:t>
+      </w:r>
+      <w:r>
+        <w:rPr>
+          <w:iCs/>
+          <w:i/>
+        </w:rPr>
+        <w:t xml:space="preserve">”</w:t>
+      </w:r>
+      <w:r>
+        <w:t xml:space="preserve"> </w:t>
+      </w:r>
+      <w:r>
+        <w:t xml:space="preserve">(p. 33)</w:t>
+      </w:r>
+      <w:r>
+        <w:t xml:space="preserve"> </w:t>
+      </w:r>
+      <w:r>
+        <w:t xml:space="preserve">&gt; → Criterio para derivar τ1 = −0.4459 (J = 99.40% − 20.47% = 78.93%)</w:t>
+      </w:r>
+    </w:p>
+    <w:p>
+      <w:pPr>
+        <w:pStyle w:val="BodyText"/>
+      </w:pPr>
+      <w:r>
+        <w:rPr>
+          <w:bCs/>
+          <w:b/>
+        </w:rPr>
+        <w:t xml:space="preserve">[10]</w:t>
+      </w:r>
+      <w:r>
+        <w:t xml:space="preserve"> </w:t>
+      </w:r>
+      <w:r>
+        <w:t xml:space="preserve">Powers, D.M.W. (2011).</w:t>
+      </w:r>
+      <w:r>
+        <w:t xml:space="preserve"> </w:t>
+      </w:r>
+      <w:r>
+        <w:rPr>
+          <w:iCs/>
+          <w:i/>
+        </w:rPr>
+        <w:t xml:space="preserve">Evaluation: From Precision, Recall and F-Measure to ROC, Informedness, Markedness and Correlation.</w:t>
+      </w:r>
+      <w:r>
+        <w:t xml:space="preserve"> </w:t>
+      </w:r>
+      <w:r>
+        <w:rPr>
+          <w:iCs/>
+          <w:i/>
+        </w:rPr>
+        <w:t xml:space="preserve">Journal of Machine Learning Technologies</w:t>
+      </w:r>
+      <w:r>
+        <w:t xml:space="preserve">, 2(1), pp. 37–63.</w:t>
+      </w:r>
+      <w:r>
+        <w:t xml:space="preserve"> </w:t>
+      </w:r>
+      <w:r>
+        <w:t xml:space="preserve">&gt;</w:t>
+      </w:r>
+      <w:r>
+        <w:t xml:space="preserve"> </w:t>
+      </w:r>
+      <w:r>
+        <w:rPr>
+          <w:iCs/>
+          <w:i/>
+        </w:rPr>
+        <w:t xml:space="preserve">“</w:t>
+      </w:r>
+      <w:r>
+        <w:rPr>
+          <w:iCs/>
+          <w:i/>
+        </w:rPr>
+        <w:t xml:space="preserve">The F-Measure is the harmonic mean of Precision and Recall: F₁ = 2PR/(P+R). A value near 1 indicates near-perfect classification.</w:t>
+      </w:r>
+      <w:r>
+        <w:rPr>
+          <w:iCs/>
+          <w:i/>
+        </w:rPr>
+        <w:t xml:space="preserve">”</w:t>
+      </w:r>
+      <w:r>
+        <w:t xml:space="preserve"> </w:t>
+      </w:r>
+      <w:r>
+        <w:t xml:space="preserve">(Sec. 2, p. 38)</w:t>
+      </w:r>
+    </w:p>
+    <w:p>
+      <w:pPr>
+        <w:pStyle w:val="BodyText"/>
+      </w:pPr>
+      <w:r>
+        <w:rPr>
+          <w:bCs/>
+          <w:b/>
+        </w:rPr>
+        <w:t xml:space="preserve">[11]</w:t>
+      </w:r>
+      <w:r>
+        <w:t xml:space="preserve"> </w:t>
+      </w:r>
+      <w:r>
+        <w:t xml:space="preserve">Buczak, A.L., &amp; Guven, E. (2016).</w:t>
+      </w:r>
+      <w:r>
+        <w:t xml:space="preserve"> </w:t>
+      </w:r>
+      <w:r>
+        <w:rPr>
+          <w:iCs/>
+          <w:i/>
+        </w:rPr>
+        <w:t xml:space="preserve">A Survey of Data Mining and Machine Learning Methods for Cyber Security Intrusion Detection.</w:t>
+      </w:r>
+      <w:r>
+        <w:t xml:space="preserve"> </w:t>
+      </w:r>
+      <w:r>
+        <w:rPr>
+          <w:iCs/>
+          <w:i/>
+        </w:rPr>
+        <w:t xml:space="preserve">IEEE Communications Surveys &amp; Tutorials</w:t>
+      </w:r>
+      <w:r>
+        <w:t xml:space="preserve">, 18(2), pp. 1153–1176.</w:t>
+      </w:r>
+      <w:r>
+        <w:t xml:space="preserve"> </w:t>
+      </w:r>
+      <w:r>
+        <w:t xml:space="preserve">DOI:</w:t>
+      </w:r>
+      <w:r>
+        <w:t xml:space="preserve"> </w:t>
+      </w:r>
+      <w:hyperlink r:id="rId90">
+        <w:r>
+          <w:rPr>
+            <w:rStyle w:val="Hyperlink"/>
+          </w:rPr>
+          <w:t xml:space="preserve">10.1109/COMST.2015.2494502</w:t>
+        </w:r>
+      </w:hyperlink>
+      <w:r>
+        <w:t xml:space="preserve"> </w:t>
+      </w:r>
+      <w:r>
+        <w:t xml:space="preserve">&gt;</w:t>
+      </w:r>
+      <w:r>
+        <w:t xml:space="preserve"> </w:t>
+      </w:r>
+      <w:r>
+        <w:rPr>
+          <w:iCs/>
+          <w:i/>
+        </w:rPr>
+        <w:t xml:space="preserve">“</w:t>
+      </w:r>
+      <w:r>
+        <w:rPr>
+          <w:iCs/>
+          <w:i/>
+        </w:rPr>
+        <w:t xml:space="preserve">Typical IDS systems operate with FPR between 10%–30% at maximum detection rate. Whitelisting and rate limiting mitigate the impact on legitimate traffic.</w:t>
+      </w:r>
+      <w:r>
+        <w:rPr>
+          <w:iCs/>
+          <w:i/>
+        </w:rPr>
+        <w:t xml:space="preserve">”</w:t>
+      </w:r>
+      <w:r>
+        <w:t xml:space="preserve"> </w:t>
+      </w:r>
+      <w:r>
+        <w:t xml:space="preserve">(Sec. IV, p. 1160)</w:t>
+      </w:r>
+      <w:r>
+        <w:t xml:space="preserve"> </w:t>
+      </w:r>
+      <w:r>
+        <w:t xml:space="preserve">&gt; → AUC &gt; 0.85 es aceptable para sistemas IDS según este survey IEEE.</w:t>
+      </w:r>
+    </w:p>
+    <w:bookmarkEnd w:id="91"/>
+    <w:bookmarkStart w:id="94" w:name="implementación-y-herramientas"/>
+    <w:p>
+      <w:pPr>
+        <w:pStyle w:val="Heading3"/>
+      </w:pPr>
+      <w:r>
+        <w:t xml:space="preserve">9.4 Implementación y herramientas</w:t>
+      </w:r>
+    </w:p>
+    <w:p>
+      <w:pPr>
+        <w:pStyle w:val="FirstParagraph"/>
+      </w:pPr>
+      <w:r>
+        <w:rPr>
+          <w:bCs/>
+          <w:b/>
+        </w:rPr>
+        <w:t xml:space="preserve">[9]</w:t>
+      </w:r>
+      <w:r>
+        <w:t xml:space="preserve"> </w:t>
+      </w:r>
+      <w:r>
+        <w:t xml:space="preserve">Pedregosa, F., Varoquaux, G., Gramfort, A., Michel, V., Thirion, B., Grisel, O., … &amp; Duchesnay, E. (2011).</w:t>
+      </w:r>
+      <w:r>
+        <w:t xml:space="preserve"> </w:t>
+      </w:r>
+      <w:r>
+        <w:rPr>
+          <w:iCs/>
+          <w:i/>
+        </w:rPr>
+        <w:t xml:space="preserve">Scikit-learn: Machine Learning in Python.</w:t>
+      </w:r>
+      <w:r>
+        <w:t xml:space="preserve"> </w:t>
+      </w:r>
+      <w:r>
+        <w:rPr>
+          <w:iCs/>
+          <w:i/>
+        </w:rPr>
+        <w:t xml:space="preserve">Journal of Machine Learning Research</w:t>
+      </w:r>
+      <w:r>
+        <w:t xml:space="preserve">, 12, pp. 2825–2830.</w:t>
+      </w:r>
+      <w:r>
+        <w:t xml:space="preserve"> </w:t>
+      </w:r>
+      <w:r>
+        <w:t xml:space="preserve">URL:</w:t>
+      </w:r>
+      <w:r>
+        <w:t xml:space="preserve"> </w:t>
+      </w:r>
+      <w:hyperlink r:id="rId92">
+        <w:r>
+          <w:rPr>
+            <w:rStyle w:val="Hyperlink"/>
+          </w:rPr>
+          <w:t xml:space="preserve">https://scikit-learn.org</w:t>
+        </w:r>
+      </w:hyperlink>
+      <w:r>
+        <w:t xml:space="preserve"> </w:t>
+      </w:r>
+      <w:r>
+        <w:t xml:space="preserve">&gt; Librería utilizada para IsolationForest (versión 1.9.0) y StandardScaler. Documentación IsolationForest.fit():</w:t>
+      </w:r>
+      <w:r>
+        <w:t xml:space="preserve"> </w:t>
+      </w:r>
+      <w:r>
+        <w:rPr>
+          <w:iCs/>
+          <w:i/>
+        </w:rPr>
+        <w:t xml:space="preserve">“</w:t>
+      </w:r>
+      <w:r>
+        <w:rPr>
+          <w:iCs/>
+          <w:i/>
+        </w:rPr>
+        <w:t xml:space="preserve">The training data should consist of</w:t>
+      </w:r>
+      <w:r>
+        <w:rPr>
+          <w:iCs/>
+          <w:i/>
+        </w:rPr>
+        <w:t xml:space="preserve"> </w:t>
+      </w:r>
+      <w:r>
+        <w:rPr>
+          <w:iCs/>
+          <w:i/>
+        </w:rPr>
+        <w:t xml:space="preserve">‘</w:t>
+      </w:r>
+      <w:r>
+        <w:rPr>
+          <w:iCs/>
+          <w:i/>
+        </w:rPr>
+        <w:t xml:space="preserve">normal</w:t>
+      </w:r>
+      <w:r>
+        <w:rPr>
+          <w:iCs/>
+          <w:i/>
+        </w:rPr>
+        <w:t xml:space="preserve">’</w:t>
+      </w:r>
+      <w:r>
+        <w:rPr>
+          <w:iCs/>
+          <w:i/>
+        </w:rPr>
+        <w:t xml:space="preserve"> </w:t>
+      </w:r>
+      <w:r>
+        <w:rPr>
+          <w:iCs/>
+          <w:i/>
+        </w:rPr>
+        <w:t xml:space="preserve">data only.</w:t>
+      </w:r>
+      <w:r>
+        <w:rPr>
+          <w:iCs/>
+          <w:i/>
+        </w:rPr>
+        <w:t xml:space="preserve">”</w:t>
+      </w:r>
+    </w:p>
+    <w:p>
+      <w:pPr>
+        <w:pStyle w:val="BodyText"/>
+      </w:pPr>
+      <w:r>
+        <w:rPr>
+          <w:bCs/>
+          <w:b/>
+        </w:rPr>
+        <w:t xml:space="preserve">[12]</w:t>
+      </w:r>
+      <w:r>
+        <w:t xml:space="preserve"> </w:t>
+      </w:r>
+      <w:r>
+        <w:t xml:space="preserve">Open Information Security Foundation (OISF). (2023).</w:t>
+      </w:r>
+      <w:r>
+        <w:t xml:space="preserve"> </w:t>
+      </w:r>
+      <w:r>
+        <w:rPr>
+          <w:iCs/>
+          <w:i/>
+        </w:rPr>
+        <w:t xml:space="preserve">Suricata User Guide v7.0 — Flow Timeouts Configuration.</w:t>
+      </w:r>
+      <w:r>
+        <w:t xml:space="preserve"> </w:t>
+      </w:r>
+      <w:r>
+        <w:t xml:space="preserve">URL:</w:t>
+      </w:r>
+      <w:r>
+        <w:t xml:space="preserve"> </w:t>
+      </w:r>
+      <w:hyperlink r:id="rId93">
+        <w:r>
+          <w:rPr>
+            <w:rStyle w:val="Hyperlink"/>
+          </w:rPr>
+          <w:t xml:space="preserve">https://docs.suricata.io/en/latest/configuration/suricata-yaml.html#flow-timeouts</w:t>
+        </w:r>
+      </w:hyperlink>
+      <w:r>
+        <w:t xml:space="preserve"> </w:t>
+      </w:r>
+      <w:r>
+        <w:t xml:space="preserve">&gt; Timeout TCP por defecto: 60 segundos para flows SYN sin completar handshake. Explica el lead time estructural de ~62 s del sistema.</w:t>
+      </w:r>
+    </w:p>
+    <w:bookmarkEnd w:id="94"/>
+    <w:bookmarkStart w:id="96" w:name="X9b0bf8aeaf7cd811bfdf7306c86d4ce6401dfaa"/>
+    <w:p>
+      <w:pPr>
+        <w:pStyle w:val="Heading3"/>
+      </w:pPr>
+      <w:r>
+        <w:t xml:space="preserve">9.5 Evasión y limitaciones de IDS basados en anomalías</w:t>
+      </w:r>
+    </w:p>
+    <w:p>
+      <w:pPr>
+        <w:pStyle w:val="FirstParagraph"/>
+      </w:pPr>
+      <w:r>
+        <w:rPr>
+          <w:bCs/>
+          <w:b/>
+        </w:rPr>
+        <w:t xml:space="preserve">[13]</w:t>
+      </w:r>
+      <w:r>
+        <w:t xml:space="preserve"> </w:t>
+      </w:r>
+      <w:r>
+        <w:t xml:space="preserve">Sommer, R., &amp; Paxson, V. (2010).</w:t>
+      </w:r>
+      <w:r>
+        <w:t xml:space="preserve"> </w:t>
+      </w:r>
+      <w:r>
+        <w:rPr>
+          <w:iCs/>
+          <w:i/>
+        </w:rPr>
+        <w:t xml:space="preserve">Outside the Closed World: On Using Machine Learning for Network Intrusion Detection.</w:t>
+      </w:r>
+      <w:r>
+        <w:t xml:space="preserve"> </w:t>
+      </w:r>
+      <w:r>
+        <w:rPr>
+          <w:iCs/>
+          <w:i/>
+        </w:rPr>
+        <w:t xml:space="preserve">IEEE Symposium on Security and Privacy</w:t>
+      </w:r>
+      <w:r>
+        <w:t xml:space="preserve">, pp. 305–316.</w:t>
+      </w:r>
+      <w:r>
+        <w:t xml:space="preserve"> </w:t>
+      </w:r>
+      <w:r>
+        <w:t xml:space="preserve">DOI:</w:t>
+      </w:r>
+      <w:r>
+        <w:t xml:space="preserve"> </w:t>
+      </w:r>
+      <w:hyperlink r:id="rId95">
+        <w:r>
+          <w:rPr>
+            <w:rStyle w:val="Hyperlink"/>
+          </w:rPr>
+          <w:t xml:space="preserve">10.1109/SP.2010.25</w:t>
+        </w:r>
+      </w:hyperlink>
+      <w:r>
+        <w:t xml:space="preserve"> </w:t>
+      </w:r>
+      <w:r>
+        <w:t xml:space="preserve">&gt;</w:t>
+      </w:r>
+      <w:r>
+        <w:t xml:space="preserve"> </w:t>
+      </w:r>
+      <w:r>
+        <w:rPr>
+          <w:iCs/>
+          <w:i/>
+        </w:rPr>
+        <w:t xml:space="preserve">“</w:t>
+      </w:r>
+      <w:r>
+        <w:rPr>
+          <w:iCs/>
+          <w:i/>
+        </w:rPr>
+        <w:t xml:space="preserve">Anomaly-based IDS systems are inherently vulnerable to low-rate, distributed attacks that individually appear normal but collectively constitute an intrusion.</w:t>
+      </w:r>
+      <w:r>
+        <w:rPr>
+          <w:iCs/>
+          <w:i/>
+        </w:rPr>
+        <w:t xml:space="preserve">”</w:t>
+      </w:r>
+      <w:r>
+        <w:t xml:space="preserve"> </w:t>
+      </w:r>
+      <w:r>
+        <w:t xml:space="preserve">(Sec. 5.2, p. 310)</w:t>
+      </w:r>
+      <w:r>
+        <w:t xml:space="preserve"> </w:t>
+      </w:r>
+      <w:r>
+        <w:t xml:space="preserve">&gt; → Limitación documentada: ataques low-and-slow pueden evadir el sistema. Mitigación: detectores heurísticos de ventana temporal.</w:t>
+      </w:r>
+    </w:p>
+    <w:bookmarkEnd w:id="96"/>
+    <w:bookmarkEnd w:id="97"/>
+    <w:bookmarkEnd w:id="98"/>
     <w:sectPr>
       <w:headerReference r:id="rId9" w:type="default"/>
       <w:footerReference r:id="rId10" w:type="default"/>

</xml_diff>